<commit_message>
Bio: bring affiliations and HKFEI title in line with CV
English and Chinese halves:
  - HKFEI title: "research director" / 研究總監 -> "founding director and
    chairperson" / 創辦總監兼主席 (the latter as on HKFEI's own team page)
  - added IZA Network at LISER, Rockwool Foundation Berlin, HKU Stone
    Centre, and HKU CAMO, which were on the CV and About page but not here

Stone Centre uses HKU's official Chinese name (斯通亞洲社會經濟不平等研究中心).
No official Chinese names were found for IZA, Rockwool, or CAMO, so they
stay in English, following the bio's existing 港大Real Estate Lab.

Co-Authored-By: Claude Opus 5 (1M context) <noreply@anthropic.com>
</commit_message>
<xml_diff>
--- a/static/bio.docx
+++ b/static/bio.docx
@@ -484,7 +484,7 @@
           <w:rFonts w:hint="eastAsia"/>
           <w:lang w:eastAsia="zh-TW"/>
         </w:rPr>
-        <w:t>He is the research director</w:t>
+        <w:t>He is the founding director and chairperson</w:t>
       </w:r>
       <w:r>
         <w:t xml:space="preserve"> of local policy research think tank </w:t>
@@ -507,7 +507,7 @@
         <w:t xml:space="preserve">also </w:t>
       </w:r>
       <w:r>
-        <w:t xml:space="preserve">an invited researcher at the Abdul Latif Jameel Poverty Action Lab (J-PAL), a Fellow of the </w:t>
+        <w:t xml:space="preserve">an invited researcher at the Abdul Latif Jameel Poverty Action Lab (J-PAL), a research affiliate of the IZA Network at LISER and of the Rockwool Foundation Berlin, a faculty affiliate of the HKU Stone Centre on Socio-Economic Inequality in Asia, a faculty research fellow of the HKU Center for AI, Management, and Organizations, a Fellow of the </w:t>
       </w:r>
       <w:r>
         <w:rPr>
@@ -992,7 +992,7 @@
           <w:lang w:eastAsia="zh-TW"/>
           <w14:ligatures w14:val="none"/>
         </w:rPr>
-        <w:t>」研究總監</w:t>
+        <w:t>」創辦總監兼主席</w:t>
       </w:r>
       <w:r>
         <w:rPr>
@@ -1010,7 +1010,7 @@
           <w:lang w:eastAsia="zh-TW"/>
           <w14:ligatures w14:val="none"/>
         </w:rPr>
-        <w:t>身兼多重身份：賈米爾貧困行動實驗室（J-PAL）特邀研究員、香港大學當代中國與世界研究中心研究員、</w:t>
+        <w:t>身兼多重身份：賈米爾貧困行動實驗室（J-PAL）特邀研究員、IZA Network at LISER研究員、Rockwool Foundation Berlin研究員、香港大學斯通亞洲社會經濟不平等研究中心成員、港大Center for AI, Management, and Organizations研究員、香港大學當代中國與世界研究中心研究員、</w:t>
       </w:r>
       <w:r>
         <w:rPr>

</xml_diff>